<commit_message>
Document PR metadata and hidden grading workflow
</commit_message>
<xml_diff>
--- a/PRD.docx
+++ b/PRD.docx
@@ -3044,6 +3044,529 @@
     </w:p>
     <w:p>
       <w:pPr>
+        <w:pStyle w:val="Heading2"/>
+      </w:pPr>
+      <w:r>
+        <w:t>12.1 Pull Request 信息填写要求</w:t>
+      </w:r>
+    </w:p>
+    <w:p>
+      <w:r>
+        <w:t>学生创建 Pull Request 时，必须按照仓库中的 PR 模板填写个人身份和提交信息。这些信息将用于教师后续自动整理学生名单、定位学生仓库并运行隐藏验证集。</w:t>
+      </w:r>
+    </w:p>
+    <w:tbl>
+      <w:tblPr>
+        <w:tblStyle w:val="TableGrid"/>
+        <w:tblW w:type="dxa" w:w="10080"/>
+        <w:jc w:val="left"/>
+        <w:tblLayout w:type="fixed"/>
+        <w:tblLook w:firstColumn="1" w:firstRow="1" w:lastColumn="0" w:lastRow="0" w:noHBand="0" w:noVBand="1" w:val="04A0"/>
+      </w:tblPr>
+      <w:tblGrid>
+        <w:gridCol w:w="5040"/>
+        <w:gridCol w:w="5040"/>
+      </w:tblGrid>
+      <w:tr>
+        <w:tc>
+          <w:tcPr>
+            <w:tcW w:type="dxa" w:w="2520"/>
+            <w:vAlign w:val="center"/>
+            <w:tcMar>
+              <w:top w:w="80" w:type="dxa"/>
+              <w:start w:w="120" w:type="dxa"/>
+              <w:bottom w:w="80" w:type="dxa"/>
+              <w:end w:w="120" w:type="dxa"/>
+            </w:tcMar>
+            <w:shd w:fill="F2F4F7"/>
+          </w:tcPr>
+          <w:p>
+            <w:pPr>
+              <w:spacing w:after="0"/>
+            </w:pPr>
+            <w:r>
+              <w:rPr>
+                <w:b/>
+                <w:sz w:val="18"/>
+              </w:rPr>
+              <w:t>字段</w:t>
+            </w:r>
+          </w:p>
+        </w:tc>
+        <w:tc>
+          <w:tcPr>
+            <w:tcW w:type="dxa" w:w="7560"/>
+            <w:vAlign w:val="center"/>
+            <w:tcMar>
+              <w:top w:w="80" w:type="dxa"/>
+              <w:start w:w="120" w:type="dxa"/>
+              <w:bottom w:w="80" w:type="dxa"/>
+              <w:end w:w="120" w:type="dxa"/>
+            </w:tcMar>
+            <w:shd w:fill="F2F4F7"/>
+          </w:tcPr>
+          <w:p>
+            <w:pPr>
+              <w:spacing w:after="0"/>
+            </w:pPr>
+            <w:r>
+              <w:rPr>
+                <w:b/>
+                <w:sz w:val="18"/>
+              </w:rPr>
+              <w:t>填写要求</w:t>
+            </w:r>
+          </w:p>
+        </w:tc>
+      </w:tr>
+      <w:tr>
+        <w:tc>
+          <w:tcPr>
+            <w:tcW w:type="dxa" w:w="2520"/>
+            <w:tcMar>
+              <w:top w:w="80" w:type="dxa"/>
+              <w:start w:w="120" w:type="dxa"/>
+              <w:bottom w:w="80" w:type="dxa"/>
+              <w:end w:w="120" w:type="dxa"/>
+            </w:tcMar>
+            <w:vAlign w:val="center"/>
+          </w:tcPr>
+          <w:p>
+            <w:pPr>
+              <w:spacing w:after="0"/>
+            </w:pPr>
+            <w:r>
+              <w:rPr>
+                <w:sz w:val="18"/>
+              </w:rPr>
+              <w:t>Student ID</w:t>
+            </w:r>
+          </w:p>
+        </w:tc>
+        <w:tc>
+          <w:tcPr>
+            <w:tcW w:type="dxa" w:w="7560"/>
+            <w:tcMar>
+              <w:top w:w="80" w:type="dxa"/>
+              <w:start w:w="120" w:type="dxa"/>
+              <w:bottom w:w="80" w:type="dxa"/>
+              <w:end w:w="120" w:type="dxa"/>
+            </w:tcMar>
+            <w:vAlign w:val="center"/>
+          </w:tcPr>
+          <w:p>
+            <w:pPr>
+              <w:spacing w:after="0"/>
+            </w:pPr>
+            <w:r>
+              <w:rPr>
+                <w:sz w:val="18"/>
+              </w:rPr>
+              <w:t>填写本人学号，必须与课程名单一致。</w:t>
+            </w:r>
+          </w:p>
+        </w:tc>
+      </w:tr>
+      <w:tr>
+        <w:tc>
+          <w:tcPr>
+            <w:tcW w:type="dxa" w:w="2520"/>
+            <w:tcMar>
+              <w:top w:w="80" w:type="dxa"/>
+              <w:start w:w="120" w:type="dxa"/>
+              <w:bottom w:w="80" w:type="dxa"/>
+              <w:end w:w="120" w:type="dxa"/>
+            </w:tcMar>
+            <w:vAlign w:val="center"/>
+          </w:tcPr>
+          <w:p>
+            <w:pPr>
+              <w:spacing w:after="0"/>
+            </w:pPr>
+            <w:r>
+              <w:rPr>
+                <w:sz w:val="18"/>
+              </w:rPr>
+              <w:t>Name</w:t>
+            </w:r>
+          </w:p>
+        </w:tc>
+        <w:tc>
+          <w:tcPr>
+            <w:tcW w:type="dxa" w:w="7560"/>
+            <w:tcMar>
+              <w:top w:w="80" w:type="dxa"/>
+              <w:start w:w="120" w:type="dxa"/>
+              <w:bottom w:w="80" w:type="dxa"/>
+              <w:end w:w="120" w:type="dxa"/>
+            </w:tcMar>
+            <w:vAlign w:val="center"/>
+          </w:tcPr>
+          <w:p>
+            <w:pPr>
+              <w:spacing w:after="0"/>
+            </w:pPr>
+            <w:r>
+              <w:rPr>
+                <w:sz w:val="18"/>
+              </w:rPr>
+              <w:t>填写本人中文姓名，必须与课程名单一致。</w:t>
+            </w:r>
+          </w:p>
+        </w:tc>
+      </w:tr>
+      <w:tr>
+        <w:tc>
+          <w:tcPr>
+            <w:tcW w:type="dxa" w:w="2520"/>
+            <w:tcMar>
+              <w:top w:w="80" w:type="dxa"/>
+              <w:start w:w="120" w:type="dxa"/>
+              <w:bottom w:w="80" w:type="dxa"/>
+              <w:end w:w="120" w:type="dxa"/>
+            </w:tcMar>
+            <w:vAlign w:val="center"/>
+          </w:tcPr>
+          <w:p>
+            <w:pPr>
+              <w:spacing w:after="0"/>
+            </w:pPr>
+            <w:r>
+              <w:rPr>
+                <w:sz w:val="18"/>
+              </w:rPr>
+              <w:t>GitHub username</w:t>
+            </w:r>
+          </w:p>
+        </w:tc>
+        <w:tc>
+          <w:tcPr>
+            <w:tcW w:type="dxa" w:w="7560"/>
+            <w:tcMar>
+              <w:top w:w="80" w:type="dxa"/>
+              <w:start w:w="120" w:type="dxa"/>
+              <w:bottom w:w="80" w:type="dxa"/>
+              <w:end w:w="120" w:type="dxa"/>
+            </w:tcMar>
+            <w:vAlign w:val="center"/>
+          </w:tcPr>
+          <w:p>
+            <w:pPr>
+              <w:spacing w:after="0"/>
+            </w:pPr>
+            <w:r>
+              <w:rPr>
+                <w:sz w:val="18"/>
+              </w:rPr>
+              <w:t>填写本人 GitHub 用户名。</w:t>
+            </w:r>
+          </w:p>
+        </w:tc>
+      </w:tr>
+      <w:tr>
+        <w:tc>
+          <w:tcPr>
+            <w:tcW w:type="dxa" w:w="2520"/>
+            <w:tcMar>
+              <w:top w:w="80" w:type="dxa"/>
+              <w:start w:w="120" w:type="dxa"/>
+              <w:bottom w:w="80" w:type="dxa"/>
+              <w:end w:w="120" w:type="dxa"/>
+            </w:tcMar>
+            <w:vAlign w:val="center"/>
+          </w:tcPr>
+          <w:p>
+            <w:pPr>
+              <w:spacing w:after="0"/>
+            </w:pPr>
+            <w:r>
+              <w:rPr>
+                <w:sz w:val="18"/>
+              </w:rPr>
+              <w:t>Fork repository URL</w:t>
+            </w:r>
+          </w:p>
+        </w:tc>
+        <w:tc>
+          <w:tcPr>
+            <w:tcW w:type="dxa" w:w="7560"/>
+            <w:tcMar>
+              <w:top w:w="80" w:type="dxa"/>
+              <w:start w:w="120" w:type="dxa"/>
+              <w:bottom w:w="80" w:type="dxa"/>
+              <w:end w:w="120" w:type="dxa"/>
+            </w:tcMar>
+            <w:vAlign w:val="center"/>
+          </w:tcPr>
+          <w:p>
+            <w:pPr>
+              <w:spacing w:after="0"/>
+            </w:pPr>
+            <w:r>
+              <w:rPr>
+                <w:sz w:val="18"/>
+              </w:rPr>
+              <w:t>填写自己 Fork 后的仓库地址，例如 https://github.com/&lt;username&gt;/wireless-final-project-template.git。</w:t>
+            </w:r>
+          </w:p>
+        </w:tc>
+      </w:tr>
+      <w:tr>
+        <w:tc>
+          <w:tcPr>
+            <w:tcW w:type="dxa" w:w="2520"/>
+            <w:tcMar>
+              <w:top w:w="80" w:type="dxa"/>
+              <w:start w:w="120" w:type="dxa"/>
+              <w:bottom w:w="80" w:type="dxa"/>
+              <w:end w:w="120" w:type="dxa"/>
+            </w:tcMar>
+            <w:vAlign w:val="center"/>
+          </w:tcPr>
+          <w:p>
+            <w:pPr>
+              <w:spacing w:after="0"/>
+            </w:pPr>
+            <w:r>
+              <w:rPr>
+                <w:sz w:val="18"/>
+              </w:rPr>
+              <w:t>Branch</w:t>
+            </w:r>
+          </w:p>
+        </w:tc>
+        <w:tc>
+          <w:tcPr>
+            <w:tcW w:type="dxa" w:w="7560"/>
+            <w:tcMar>
+              <w:top w:w="80" w:type="dxa"/>
+              <w:start w:w="120" w:type="dxa"/>
+              <w:bottom w:w="80" w:type="dxa"/>
+              <w:end w:w="120" w:type="dxa"/>
+            </w:tcMar>
+            <w:vAlign w:val="center"/>
+          </w:tcPr>
+          <w:p>
+            <w:pPr>
+              <w:spacing w:after="0"/>
+            </w:pPr>
+            <w:r>
+              <w:rPr>
+                <w:sz w:val="18"/>
+              </w:rPr>
+              <w:t>填写提交分支，默认通常为 main。</w:t>
+            </w:r>
+          </w:p>
+        </w:tc>
+      </w:tr>
+      <w:tr>
+        <w:tc>
+          <w:tcPr>
+            <w:tcW w:type="dxa" w:w="2520"/>
+            <w:tcMar>
+              <w:top w:w="80" w:type="dxa"/>
+              <w:start w:w="120" w:type="dxa"/>
+              <w:bottom w:w="80" w:type="dxa"/>
+              <w:end w:w="120" w:type="dxa"/>
+            </w:tcMar>
+            <w:vAlign w:val="center"/>
+          </w:tcPr>
+          <w:p>
+            <w:pPr>
+              <w:spacing w:after="0"/>
+            </w:pPr>
+            <w:r>
+              <w:rPr>
+                <w:sz w:val="18"/>
+              </w:rPr>
+              <w:t>PR number</w:t>
+            </w:r>
+          </w:p>
+        </w:tc>
+        <w:tc>
+          <w:tcPr>
+            <w:tcW w:type="dxa" w:w="7560"/>
+            <w:tcMar>
+              <w:top w:w="80" w:type="dxa"/>
+              <w:start w:w="120" w:type="dxa"/>
+              <w:bottom w:w="80" w:type="dxa"/>
+              <w:end w:w="120" w:type="dxa"/>
+            </w:tcMar>
+            <w:vAlign w:val="center"/>
+          </w:tcPr>
+          <w:p>
+            <w:pPr>
+              <w:spacing w:after="0"/>
+            </w:pPr>
+            <w:r>
+              <w:rPr>
+                <w:sz w:val="18"/>
+              </w:rPr>
+              <w:t>GitHub 创建 Pull Request 后自动生成；学生可先留空，创建后补填。</w:t>
+            </w:r>
+          </w:p>
+        </w:tc>
+      </w:tr>
+      <w:tr>
+        <w:tc>
+          <w:tcPr>
+            <w:tcW w:type="dxa" w:w="2520"/>
+            <w:tcMar>
+              <w:top w:w="80" w:type="dxa"/>
+              <w:start w:w="120" w:type="dxa"/>
+              <w:bottom w:w="80" w:type="dxa"/>
+              <w:end w:w="120" w:type="dxa"/>
+            </w:tcMar>
+            <w:vAlign w:val="center"/>
+          </w:tcPr>
+          <w:p>
+            <w:pPr>
+              <w:spacing w:after="0"/>
+            </w:pPr>
+            <w:r>
+              <w:rPr>
+                <w:sz w:val="18"/>
+              </w:rPr>
+              <w:t>Checklist</w:t>
+            </w:r>
+          </w:p>
+        </w:tc>
+        <w:tc>
+          <w:tcPr>
+            <w:tcW w:type="dxa" w:w="7560"/>
+            <w:tcMar>
+              <w:top w:w="80" w:type="dxa"/>
+              <w:start w:w="120" w:type="dxa"/>
+              <w:bottom w:w="80" w:type="dxa"/>
+              <w:end w:w="120" w:type="dxa"/>
+            </w:tcMar>
+            <w:vAlign w:val="center"/>
+          </w:tcPr>
+          <w:p>
+            <w:pPr>
+              <w:spacing w:after="0"/>
+            </w:pPr>
+            <w:r>
+              <w:rPr>
+                <w:sz w:val="18"/>
+              </w:rPr>
+              <w:t>逐项勾选是否已完成 DESIGN.md、TEST_PLAN.md、MOCK_TEST_REPORT.md、AI_LOG.md、main.py、src/、tests/、results/ 等提交物。</w:t>
+            </w:r>
+          </w:p>
+        </w:tc>
+      </w:tr>
+    </w:tbl>
+    <w:p/>
+    <w:p>
+      <w:pPr>
+        <w:pStyle w:val="Heading2"/>
+      </w:pPr>
+      <w:r>
+        <w:t>12.2 教师自动记录与隐藏验收</w:t>
+      </w:r>
+    </w:p>
+    <w:p>
+      <w:r>
+        <w:t>教师端将使用私有评分仓库 wireless-final-project-grader 进行隐藏验收。截止后，教师可从 GitHub Pull Request 自动导出 students.csv。该文件记录每位学生的学号、姓名、GitHub 用户名、Fork 仓库地址、提交分支和 PR 编号。</w:t>
+      </w:r>
+    </w:p>
+    <w:p>
+      <w:r>
+        <w:t>自动导出优先使用学生在 PR 模板中填写的信息；若学生漏填部分字段，教师脚本会尝试从 GitHub PR 元数据补全：</w:t>
+      </w:r>
+    </w:p>
+    <w:p>
+      <w:pPr>
+        <w:pStyle w:val="ListBullet"/>
+      </w:pPr>
+      <w:r>
+        <w:t>GitHub 用户名：来自 PR author。</w:t>
+      </w:r>
+    </w:p>
+    <w:p>
+      <w:pPr>
+        <w:pStyle w:val="ListBullet"/>
+      </w:pPr>
+      <w:r>
+        <w:t>Fork 仓库地址：来自 PR head repository clone URL。</w:t>
+      </w:r>
+    </w:p>
+    <w:p>
+      <w:pPr>
+        <w:pStyle w:val="ListBullet"/>
+      </w:pPr>
+      <w:r>
+        <w:t>提交分支：来自 PR head branch。</w:t>
+      </w:r>
+    </w:p>
+    <w:p>
+      <w:pPr>
+        <w:pStyle w:val="ListBullet"/>
+      </w:pPr>
+      <w:r>
+        <w:t>PR 编号：来自 GitHub PR number。</w:t>
+      </w:r>
+    </w:p>
+    <w:p>
+      <w:r>
+        <w:t>教师隐藏验收流程如下：</w:t>
+      </w:r>
+    </w:p>
+    <w:p>
+      <w:pPr>
+        <w:pStyle w:val="ListNumber"/>
+      </w:pPr>
+      <w:r>
+        <w:t>截止后，教师在私有评分仓库 wireless-final-project-grader 中手动触发 hidden-validation workflow，或本地运行评分脚本。</w:t>
+      </w:r>
+    </w:p>
+    <w:p>
+      <w:pPr>
+        <w:pStyle w:val="ListNumber"/>
+      </w:pPr>
+      <w:r>
+        <w:t>评分脚本从教师模板仓库的 Pull Request 列表自动导出 students.csv。</w:t>
+      </w:r>
+    </w:p>
+    <w:p>
+      <w:pPr>
+        <w:pStyle w:val="ListNumber"/>
+      </w:pPr>
+      <w:r>
+        <w:t>评分脚本根据 students.csv 批量 clone 学生 Fork 仓库。</w:t>
+      </w:r>
+    </w:p>
+    <w:p>
+      <w:pPr>
+        <w:pStyle w:val="ListNumber"/>
+      </w:pPr>
+      <w:r>
+        <w:t>评分脚本复制隐藏测试集和隐藏 Test.txt 到学生项目运行环境。</w:t>
+      </w:r>
+    </w:p>
+    <w:p>
+      <w:pPr>
+        <w:pStyle w:val="ListNumber"/>
+      </w:pPr>
+      <w:r>
+        <w:t>评分脚本运行隐藏 pytest 验证集，检查不同文本、不同 SNR、不同 seed、同步偏移、异常参数、反硬编码和文档一致性。</w:t>
+      </w:r>
+    </w:p>
+    <w:p>
+      <w:pPr>
+        <w:pStyle w:val="ListNumber"/>
+      </w:pPr>
+      <w:r>
+        <w:t>评分脚本生成 results/grade_report.csv，作为隐藏验证集评分依据。</w:t>
+      </w:r>
+    </w:p>
+    <w:p>
+      <w:r>
+        <w:t>公开测试用于帮助学生理解需求和调试基础功能；隐藏验证集不向学生公开，主要用于最终评分和防止针对公开样例硬编码。</w:t>
+      </w:r>
+    </w:p>
+    <w:p>
+      <w:pPr>
         <w:pStyle w:val="Heading1"/>
       </w:pPr>
       <w:r>

</xml_diff>